<commit_message>
Add CLAUDE.md guardrails; USER_GUIDE covers Seed Audio / Video GEN / Dialogue Scene
- CLAUDE.md: working rules for future sessions (dev loop, never-break invariants:
  thread-safety, msgbox re-entrancy, trusted-face chain, ffmpeg, concurrency pool,
  additive _seedance_generate, prefs; the 3 separate auth paths; model/API facts)
- USER_GUIDE (md/docx/html) + dist: new sections for Video GEN (4 modes + playblast),
  Seed Audio, Dialogue Scene, per-character voice; updated menu table; 2 new
  screenshots (Seed-Audio, Video_Gen)
- dist plugin synced to current byteplus_maya.py

Co-Authored-By: Claude Opus 4.8 <noreply@anthropic.com>
</commit_message>
<xml_diff>
--- a/USER_GUIDE.docx
+++ b/USER_GUIDE.docx
@@ -574,6 +574,32 @@
             <w:r>
               <w:rPr/>
               <w:t>Renders your animated scene → 1080p AI video</w:t>
+            </w:r>
+          </w:p>
+        </w:tc>
+      </w:tr>
+      <w:tr>
+        <w:tc>
+          <w:tcPr>
+            <w:tcW w:type="dxa" w:w="4320"/>
+          </w:tcPr>
+          <w:p>
+            <w:r>
+              <w:rPr>
+                <w:b/>
+              </w:rPr>
+              <w:t>Video GEN</w:t>
+            </w:r>
+          </w:p>
+        </w:tc>
+        <w:tc>
+          <w:tcPr>
+            <w:tcW w:type="dxa" w:w="4320"/>
+          </w:tcPr>
+          <w:p>
+            <w:r>
+              <w:rPr/>
+              <w:t>Full Seedance 2.0: Text→Video / Image→Video / First+Last frame / Multimodal, + model/resolution/ratio/duration/audio</w:t>
             </w:r>
           </w:p>
         </w:tc>
@@ -750,6 +776,32 @@
               <w:rPr>
                 <w:b/>
               </w:rPr>
+              <w:t>Open Audio Gallery</w:t>
+            </w:r>
+          </w:p>
+        </w:tc>
+        <w:tc>
+          <w:tcPr>
+            <w:tcW w:type="dxa" w:w="4320"/>
+          </w:tcPr>
+          <w:p>
+            <w:r>
+              <w:rPr/>
+              <w:t>Browse / play / save your generated audio (voice / music / SFX)</w:t>
+            </w:r>
+          </w:p>
+        </w:tc>
+      </w:tr>
+      <w:tr>
+        <w:tc>
+          <w:tcPr>
+            <w:tcW w:type="dxa" w:w="4320"/>
+          </w:tcPr>
+          <w:p>
+            <w:r>
+              <w:rPr>
+                <w:b/>
+              </w:rPr>
               <w:t>Seed Chat</w:t>
             </w:r>
           </w:p>
@@ -788,6 +840,32 @@
             <w:r>
               <w:rPr/>
               <w:t>Text or image → a 3D asset, imported into your scene</w:t>
+            </w:r>
+          </w:p>
+        </w:tc>
+      </w:tr>
+      <w:tr>
+        <w:tc>
+          <w:tcPr>
+            <w:tcW w:type="dxa" w:w="4320"/>
+          </w:tcPr>
+          <w:p>
+            <w:r>
+              <w:rPr>
+                <w:b/>
+              </w:rPr>
+              <w:t>Seed Audio</w:t>
+            </w:r>
+          </w:p>
+        </w:tc>
+        <w:tc>
+          <w:tcPr>
+            <w:tcW w:type="dxa" w:w="4320"/>
+          </w:tcPr>
+          <w:p>
+            <w:r>
+              <w:rPr/>
+              <w:t>Generate voice / music / SFX (Seed Audio 1.0) — TTS, described voices, cloning</w:t>
             </w:r>
           </w:p>
         </w:tc>
@@ -860,7 +938,33 @@
             </w:r>
             <w:r>
               <w:rPr/>
-              <w:t xml:space="preserve"> you can animate forever</w:t>
+              <w:t xml:space="preserve"> you can animate forever (+ a reusable voice)</w:t>
+            </w:r>
+          </w:p>
+        </w:tc>
+      </w:tr>
+      <w:tr>
+        <w:tc>
+          <w:tcPr>
+            <w:tcW w:type="dxa" w:w="4320"/>
+          </w:tcPr>
+          <w:p>
+            <w:r>
+              <w:rPr>
+                <w:b/>
+              </w:rPr>
+              <w:t>Dialogue Scene</w:t>
+            </w:r>
+          </w:p>
+        </w:tc>
+        <w:tc>
+          <w:tcPr>
+            <w:tcW w:type="dxa" w:w="4320"/>
+          </w:tcPr>
+          <w:p>
+            <w:r>
+              <w:rPr/>
+              <w:t>Multi-character spoken dialogue → Seedance video with synced voices (EN/ES/JA/ID/PT)</w:t>
             </w:r>
           </w:p>
         </w:tc>
@@ -1520,6 +1624,334 @@
         <w:pStyle w:val="Heading2"/>
       </w:pPr>
       <w:r>
+        <w:t>🎥 Video GEN</w:t>
+      </w:r>
+    </w:p>
+    <w:p>
+      <w:r>
+        <w:rPr/>
+        <w:t xml:space="preserve">The full </w:t>
+      </w:r>
+      <w:r>
+        <w:rPr>
+          <w:b/>
+        </w:rPr>
+        <w:t>Seedance 2.0</w:t>
+      </w:r>
+      <w:r>
+        <w:rPr/>
+        <w:t xml:space="preserve"> generator in one window — every modality and parameter.</w:t>
+      </w:r>
+    </w:p>
+    <w:p>
+      <w:pPr>
+        <w:pStyle w:val="ListNumber"/>
+      </w:pPr>
+      <w:r>
+        <w:rPr>
+          <w:b/>
+        </w:rPr>
+        <w:t>BYTEPLUS &gt; Video GEN</w:t>
+      </w:r>
+      <w:r>
+        <w:rPr/>
+        <w:t>.</w:t>
+      </w:r>
+    </w:p>
+    <w:p>
+      <w:pPr>
+        <w:pStyle w:val="ListNumber"/>
+      </w:pPr>
+      <w:r>
+        <w:rPr/>
+        <w:t xml:space="preserve">Pick a </w:t>
+      </w:r>
+      <w:r>
+        <w:rPr>
+          <w:b/>
+        </w:rPr>
+        <w:t>Mode</w:t>
+      </w:r>
+      <w:r>
+        <w:rPr/>
+        <w:t>:</w:t>
+      </w:r>
+    </w:p>
+    <w:p>
+      <w:pPr>
+        <w:pStyle w:val="ListBullet"/>
+      </w:pPr>
+      <w:r>
+        <w:rPr>
+          <w:b/>
+        </w:rPr>
+        <w:t>Text → Video</w:t>
+      </w:r>
+      <w:r>
+        <w:rPr/>
+        <w:t xml:space="preserve"> — pure prompt.</w:t>
+      </w:r>
+    </w:p>
+    <w:p>
+      <w:pPr>
+        <w:pStyle w:val="ListBullet"/>
+      </w:pPr>
+      <w:r>
+        <w:rPr>
+          <w:b/>
+        </w:rPr>
+        <w:t>Image → Video</w:t>
+      </w:r>
+      <w:r>
+        <w:rPr/>
+        <w:t xml:space="preserve"> — animate a start frame (from the gallery or a file).</w:t>
+      </w:r>
+    </w:p>
+    <w:p>
+      <w:pPr>
+        <w:pStyle w:val="ListBullet"/>
+      </w:pPr>
+      <w:r>
+        <w:rPr>
+          <w:b/>
+        </w:rPr>
+        <w:t>First + Last frame</w:t>
+      </w:r>
+      <w:r>
+        <w:rPr/>
+        <w:t xml:space="preserve"> — a start </w:t>
+      </w:r>
+      <w:r>
+        <w:rPr>
+          <w:b/>
+        </w:rPr>
+        <w:t>and</w:t>
+      </w:r>
+      <w:r>
+        <w:rPr/>
+        <w:t xml:space="preserve"> an end frame.</w:t>
+      </w:r>
+    </w:p>
+    <w:p>
+      <w:pPr>
+        <w:pStyle w:val="ListBullet"/>
+      </w:pPr>
+      <w:r>
+        <w:rPr>
+          <w:b/>
+        </w:rPr>
+        <w:t>Multimodal</w:t>
+      </w:r>
+      <w:r>
+        <w:rPr/>
+        <w:t xml:space="preserve"> — 1–9 reference images (look / identity / props) + up to 3 reference videos (motion) + up to 3 character voices.</w:t>
+      </w:r>
+    </w:p>
+    <w:p>
+      <w:pPr>
+        <w:pStyle w:val="ListNumber"/>
+      </w:pPr>
+      <w:r>
+        <w:rPr/>
+        <w:t xml:space="preserve">Choose the </w:t>
+      </w:r>
+      <w:r>
+        <w:rPr>
+          <w:b/>
+        </w:rPr>
+        <w:t>Model</w:t>
+      </w:r>
+      <w:r>
+        <w:rPr/>
+        <w:t xml:space="preserve"> (Base = 1080p/4k · Fast / Mini = 480/720, cheaper), plus </w:t>
+      </w:r>
+      <w:r>
+        <w:rPr>
+          <w:b/>
+        </w:rPr>
+        <w:t>Resolution</w:t>
+      </w:r>
+      <w:r>
+        <w:rPr/>
+        <w:t xml:space="preserve">, </w:t>
+      </w:r>
+      <w:r>
+        <w:rPr>
+          <w:b/>
+        </w:rPr>
+        <w:t>Aspect ratio</w:t>
+      </w:r>
+      <w:r>
+        <w:rPr/>
+        <w:t xml:space="preserve">, </w:t>
+      </w:r>
+      <w:r>
+        <w:rPr>
+          <w:b/>
+        </w:rPr>
+        <w:t>Duration</w:t>
+      </w:r>
+      <w:r>
+        <w:rPr/>
+        <w:t xml:space="preserve"> (or </w:t>
+      </w:r>
+      <w:r>
+        <w:rPr>
+          <w:i/>
+        </w:rPr>
+        <w:t>Auto</w:t>
+      </w:r>
+      <w:r>
+        <w:rPr/>
+        <w:t xml:space="preserve">), </w:t>
+      </w:r>
+      <w:r>
+        <w:rPr>
+          <w:b/>
+        </w:rPr>
+        <w:t>Generate audio</w:t>
+      </w:r>
+      <w:r>
+        <w:rPr/>
+        <w:t xml:space="preserve">, </w:t>
+      </w:r>
+      <w:r>
+        <w:rPr>
+          <w:b/>
+        </w:rPr>
+        <w:t>Watermark</w:t>
+      </w:r>
+      <w:r>
+        <w:rPr/>
+        <w:t xml:space="preserve"> and </w:t>
+      </w:r>
+      <w:r>
+        <w:rPr>
+          <w:b/>
+        </w:rPr>
+        <w:t>Priority</w:t>
+      </w:r>
+      <w:r>
+        <w:rPr/>
+        <w:t>.</w:t>
+      </w:r>
+    </w:p>
+    <w:p>
+      <w:pPr>
+        <w:pStyle w:val="ListNumber"/>
+      </w:pPr>
+      <w:r>
+        <w:rPr>
+          <w:i/>
+        </w:rPr>
+        <w:t>(Optional)</w:t>
+      </w:r>
+      <w:r>
+        <w:rPr/>
+        <w:t xml:space="preserve"> tick </w:t>
+      </w:r>
+      <w:r>
+        <w:rPr>
+          <w:b/>
+        </w:rPr>
+        <w:t>🎥 Use the scene's animation (playblast)</w:t>
+      </w:r>
+      <w:r>
+        <w:rPr/>
+        <w:t xml:space="preserve"> so the clip follows your Maya camera/motion (Text→Video or Multimodal; needs motion hosting).</w:t>
+      </w:r>
+    </w:p>
+    <w:p>
+      <w:pPr>
+        <w:pStyle w:val="ListNumber"/>
+      </w:pPr>
+      <w:r>
+        <w:rPr/>
+        <w:t xml:space="preserve">Write the prompt (✦ Enhance; put spoken lines in "double quotes") and </w:t>
+      </w:r>
+      <w:r>
+        <w:rPr>
+          <w:b/>
+        </w:rPr>
+        <w:t>Generate</w:t>
+      </w:r>
+      <w:r>
+        <w:rPr/>
+        <w:t xml:space="preserve"> → the clip lands in the Video Gallery.</w:t>
+      </w:r>
+    </w:p>
+    <w:p>
+      <w:pPr>
+        <w:jc w:val="center"/>
+      </w:pPr>
+      <w:r>
+        <w:drawing>
+          <wp:inline xmlns:a="http://schemas.openxmlformats.org/drawingml/2006/main" xmlns:pic="http://schemas.openxmlformats.org/drawingml/2006/picture">
+            <wp:extent cx="5760720" cy="5983510"/>
+            <wp:docPr id="6" name="Picture 6"/>
+            <wp:cNvGraphicFramePr>
+              <a:graphicFrameLocks noChangeAspect="1"/>
+            </wp:cNvGraphicFramePr>
+            <a:graphic>
+              <a:graphicData uri="http://schemas.openxmlformats.org/drawingml/2006/picture">
+                <pic:pic>
+                  <pic:nvPicPr>
+                    <pic:cNvPr id="0" name="Video_Gen.jpg"/>
+                    <pic:cNvPicPr/>
+                  </pic:nvPicPr>
+                  <pic:blipFill>
+                    <a:blip r:embed="rId14"/>
+                    <a:stretch>
+                      <a:fillRect/>
+                    </a:stretch>
+                  </pic:blipFill>
+                  <pic:spPr>
+                    <a:xfrm>
+                      <a:off x="0" y="0"/>
+                      <a:ext cx="5760720" cy="5983510"/>
+                    </a:xfrm>
+                    <a:prstGeom prst="rect"/>
+                  </pic:spPr>
+                </pic:pic>
+              </a:graphicData>
+            </a:graphic>
+          </wp:inline>
+        </w:drawing>
+      </w:r>
+    </w:p>
+    <w:p>
+      <w:pPr>
+        <w:jc w:val="center"/>
+      </w:pPr>
+      <w:r>
+        <w:rPr>
+          <w:i/>
+          <w:color w:val="888888"/>
+          <w:sz w:val="17"/>
+        </w:rPr>
+        <w:t>Video GEN</w:t>
+      </w:r>
+    </w:p>
+    <w:p>
+      <w:pPr>
+        <w:pStyle w:val="IntenseQuote"/>
+      </w:pPr>
+      <w:r>
+        <w:rPr>
+          <w:b/>
+        </w:rPr>
+        <w:t>Best practice:</w:t>
+      </w:r>
+      <w:r>
+        <w:rPr/>
+        <w:t xml:space="preserve"> prototype at 480p/720p (or Fast / Mini), lock the prompt, then re-render at 1080p/4k on Base. External human faces are rejected — use trusted images (Text to Image / Trusted Characters) for faces.</w:t>
+      </w:r>
+    </w:p>
+    <w:p>
+      <w:pPr>
+        <w:pStyle w:val="Heading2"/>
+      </w:pPr>
+      <w:r>
         <w:t>🌅 Dream with Seedreams 5.0</w:t>
       </w:r>
     </w:p>
@@ -1698,7 +2130,7 @@
         <w:drawing>
           <wp:inline xmlns:a="http://schemas.openxmlformats.org/drawingml/2006/main" xmlns:pic="http://schemas.openxmlformats.org/drawingml/2006/picture">
             <wp:extent cx="5760720" cy="7066350"/>
-            <wp:docPr id="6" name="Picture 6"/>
+            <wp:docPr id="7" name="Picture 7"/>
             <wp:cNvGraphicFramePr>
               <a:graphicFrameLocks noChangeAspect="1"/>
             </wp:cNvGraphicFramePr>
@@ -1710,7 +2142,7 @@
                     <pic:cNvPicPr/>
                   </pic:nvPicPr>
                   <pic:blipFill>
-                    <a:blip r:embed="rId14"/>
+                    <a:blip r:embed="rId15"/>
                     <a:stretch>
                       <a:fillRect/>
                     </a:stretch>
@@ -1912,7 +2344,7 @@
         <w:drawing>
           <wp:inline xmlns:a="http://schemas.openxmlformats.org/drawingml/2006/main" xmlns:pic="http://schemas.openxmlformats.org/drawingml/2006/picture">
             <wp:extent cx="5760720" cy="6628774"/>
-            <wp:docPr id="7" name="Picture 7"/>
+            <wp:docPr id="8" name="Picture 8"/>
             <wp:cNvGraphicFramePr>
               <a:graphicFrameLocks noChangeAspect="1"/>
             </wp:cNvGraphicFramePr>
@@ -1924,7 +2356,7 @@
                     <pic:cNvPicPr/>
                   </pic:nvPicPr>
                   <pic:blipFill>
-                    <a:blip r:embed="rId15"/>
+                    <a:blip r:embed="rId16"/>
                     <a:stretch>
                       <a:fillRect/>
                     </a:stretch>
@@ -2171,7 +2603,7 @@
         <w:drawing>
           <wp:inline xmlns:a="http://schemas.openxmlformats.org/drawingml/2006/main" xmlns:pic="http://schemas.openxmlformats.org/drawingml/2006/picture">
             <wp:extent cx="5760720" cy="6235351"/>
-            <wp:docPr id="8" name="Picture 8"/>
+            <wp:docPr id="9" name="Picture 9"/>
             <wp:cNvGraphicFramePr>
               <a:graphicFrameLocks noChangeAspect="1"/>
             </wp:cNvGraphicFramePr>
@@ -2183,7 +2615,7 @@
                     <pic:cNvPicPr/>
                   </pic:nvPicPr>
                   <pic:blipFill>
-                    <a:blip r:embed="rId16"/>
+                    <a:blip r:embed="rId17"/>
                     <a:stretch>
                       <a:fillRect/>
                     </a:stretch>
@@ -2425,7 +2857,7 @@
         <w:drawing>
           <wp:inline xmlns:a="http://schemas.openxmlformats.org/drawingml/2006/main" xmlns:pic="http://schemas.openxmlformats.org/drawingml/2006/picture">
             <wp:extent cx="5760720" cy="6602750"/>
-            <wp:docPr id="9" name="Picture 9"/>
+            <wp:docPr id="10" name="Picture 10"/>
             <wp:cNvGraphicFramePr>
               <a:graphicFrameLocks noChangeAspect="1"/>
             </wp:cNvGraphicFramePr>
@@ -2437,7 +2869,7 @@
                     <pic:cNvPicPr/>
                   </pic:nvPicPr>
                   <pic:blipFill>
-                    <a:blip r:embed="rId17"/>
+                    <a:blip r:embed="rId18"/>
                     <a:stretch>
                       <a:fillRect/>
                     </a:stretch>
@@ -2651,7 +3083,7 @@
         <w:drawing>
           <wp:inline xmlns:a="http://schemas.openxmlformats.org/drawingml/2006/main" xmlns:pic="http://schemas.openxmlformats.org/drawingml/2006/picture">
             <wp:extent cx="5760720" cy="4120763"/>
-            <wp:docPr id="10" name="Picture 10"/>
+            <wp:docPr id="11" name="Picture 11"/>
             <wp:cNvGraphicFramePr>
               <a:graphicFrameLocks noChangeAspect="1"/>
             </wp:cNvGraphicFramePr>
@@ -2663,7 +3095,7 @@
                     <pic:cNvPicPr/>
                   </pic:nvPicPr>
                   <pic:blipFill>
-                    <a:blip r:embed="rId18"/>
+                    <a:blip r:embed="rId19"/>
                     <a:stretch>
                       <a:fillRect/>
                     </a:stretch>
@@ -2711,7 +3143,7 @@
         <w:drawing>
           <wp:inline xmlns:a="http://schemas.openxmlformats.org/drawingml/2006/main" xmlns:pic="http://schemas.openxmlformats.org/drawingml/2006/picture">
             <wp:extent cx="5760720" cy="4477081"/>
-            <wp:docPr id="11" name="Picture 11"/>
+            <wp:docPr id="12" name="Picture 12"/>
             <wp:cNvGraphicFramePr>
               <a:graphicFrameLocks noChangeAspect="1"/>
             </wp:cNvGraphicFramePr>
@@ -2723,7 +3155,7 @@
                     <pic:cNvPicPr/>
                   </pic:nvPicPr>
                   <pic:blipFill>
-                    <a:blip r:embed="rId19"/>
+                    <a:blip r:embed="rId20"/>
                     <a:stretch>
                       <a:fillRect/>
                     </a:stretch>
@@ -2893,7 +3325,7 @@
         <w:drawing>
           <wp:inline xmlns:a="http://schemas.openxmlformats.org/drawingml/2006/main" xmlns:pic="http://schemas.openxmlformats.org/drawingml/2006/picture">
             <wp:extent cx="5760720" cy="4946127"/>
-            <wp:docPr id="12" name="Picture 12"/>
+            <wp:docPr id="13" name="Picture 13"/>
             <wp:cNvGraphicFramePr>
               <a:graphicFrameLocks noChangeAspect="1"/>
             </wp:cNvGraphicFramePr>
@@ -2905,7 +3337,7 @@
                     <pic:cNvPicPr/>
                   </pic:nvPicPr>
                   <pic:blipFill>
-                    <a:blip r:embed="rId20"/>
+                    <a:blip r:embed="rId21"/>
                     <a:stretch>
                       <a:fillRect/>
                     </a:stretch>
@@ -2953,7 +3385,7 @@
         <w:drawing>
           <wp:inline xmlns:a="http://schemas.openxmlformats.org/drawingml/2006/main" xmlns:pic="http://schemas.openxmlformats.org/drawingml/2006/picture">
             <wp:extent cx="5760720" cy="3742871"/>
-            <wp:docPr id="13" name="Picture 13"/>
+            <wp:docPr id="14" name="Picture 14"/>
             <wp:cNvGraphicFramePr>
               <a:graphicFrameLocks noChangeAspect="1"/>
             </wp:cNvGraphicFramePr>
@@ -2965,7 +3397,7 @@
                     <pic:cNvPicPr/>
                   </pic:nvPicPr>
                   <pic:blipFill>
-                    <a:blip r:embed="rId21"/>
+                    <a:blip r:embed="rId22"/>
                     <a:stretch>
                       <a:fillRect/>
                     </a:stretch>
@@ -3205,7 +3637,7 @@
         <w:drawing>
           <wp:inline xmlns:a="http://schemas.openxmlformats.org/drawingml/2006/main" xmlns:pic="http://schemas.openxmlformats.org/drawingml/2006/picture">
             <wp:extent cx="5760720" cy="6718916"/>
-            <wp:docPr id="14" name="Picture 14"/>
+            <wp:docPr id="15" name="Picture 15"/>
             <wp:cNvGraphicFramePr>
               <a:graphicFrameLocks noChangeAspect="1"/>
             </wp:cNvGraphicFramePr>
@@ -3217,7 +3649,7 @@
                     <pic:cNvPicPr/>
                   </pic:nvPicPr>
                   <pic:blipFill>
-                    <a:blip r:embed="rId22"/>
+                    <a:blip r:embed="rId23"/>
                     <a:stretch>
                       <a:fillRect/>
                     </a:stretch>
@@ -3265,7 +3697,7 @@
         <w:drawing>
           <wp:inline xmlns:a="http://schemas.openxmlformats.org/drawingml/2006/main" xmlns:pic="http://schemas.openxmlformats.org/drawingml/2006/picture">
             <wp:extent cx="5760720" cy="4133939"/>
-            <wp:docPr id="15" name="Picture 15"/>
+            <wp:docPr id="16" name="Picture 16"/>
             <wp:cNvGraphicFramePr>
               <a:graphicFrameLocks noChangeAspect="1"/>
             </wp:cNvGraphicFramePr>
@@ -3277,7 +3709,7 @@
                     <pic:cNvPicPr/>
                   </pic:nvPicPr>
                   <pic:blipFill>
-                    <a:blip r:embed="rId23"/>
+                    <a:blip r:embed="rId24"/>
                     <a:stretch>
                       <a:fillRect/>
                     </a:stretch>
@@ -3505,7 +3937,7 @@
         <w:drawing>
           <wp:inline xmlns:a="http://schemas.openxmlformats.org/drawingml/2006/main" xmlns:pic="http://schemas.openxmlformats.org/drawingml/2006/picture">
             <wp:extent cx="5760720" cy="4570898"/>
-            <wp:docPr id="16" name="Picture 16"/>
+            <wp:docPr id="17" name="Picture 17"/>
             <wp:cNvGraphicFramePr>
               <a:graphicFrameLocks noChangeAspect="1"/>
             </wp:cNvGraphicFramePr>
@@ -3517,7 +3949,7 @@
                     <pic:cNvPicPr/>
                   </pic:nvPicPr>
                   <pic:blipFill>
-                    <a:blip r:embed="rId24"/>
+                    <a:blip r:embed="rId25"/>
                     <a:stretch>
                       <a:fillRect/>
                     </a:stretch>
@@ -3557,7 +3989,7 @@
         <w:drawing>
           <wp:inline xmlns:a="http://schemas.openxmlformats.org/drawingml/2006/main" xmlns:pic="http://schemas.openxmlformats.org/drawingml/2006/picture">
             <wp:extent cx="5760720" cy="4560983"/>
-            <wp:docPr id="17" name="Picture 17"/>
+            <wp:docPr id="18" name="Picture 18"/>
             <wp:cNvGraphicFramePr>
               <a:graphicFrameLocks noChangeAspect="1"/>
             </wp:cNvGraphicFramePr>
@@ -3569,7 +4001,7 @@
                     <pic:cNvPicPr/>
                   </pic:nvPicPr>
                   <pic:blipFill>
-                    <a:blip r:embed="rId25"/>
+                    <a:blip r:embed="rId26"/>
                     <a:stretch>
                       <a:fillRect/>
                     </a:stretch>
@@ -3714,7 +4146,7 @@
         <w:drawing>
           <wp:inline xmlns:a="http://schemas.openxmlformats.org/drawingml/2006/main" xmlns:pic="http://schemas.openxmlformats.org/drawingml/2006/picture">
             <wp:extent cx="5760720" cy="4454873"/>
-            <wp:docPr id="18" name="Picture 18"/>
+            <wp:docPr id="19" name="Picture 19"/>
             <wp:cNvGraphicFramePr>
               <a:graphicFrameLocks noChangeAspect="1"/>
             </wp:cNvGraphicFramePr>
@@ -3726,7 +4158,7 @@
                     <pic:cNvPicPr/>
                   </pic:nvPicPr>
                   <pic:blipFill>
-                    <a:blip r:embed="rId26"/>
+                    <a:blip r:embed="rId27"/>
                     <a:stretch>
                       <a:fillRect/>
                     </a:stretch>
@@ -3774,7 +4206,7 @@
         <w:drawing>
           <wp:inline xmlns:a="http://schemas.openxmlformats.org/drawingml/2006/main" xmlns:pic="http://schemas.openxmlformats.org/drawingml/2006/picture">
             <wp:extent cx="5760720" cy="4461734"/>
-            <wp:docPr id="19" name="Picture 19"/>
+            <wp:docPr id="20" name="Picture 20"/>
             <wp:cNvGraphicFramePr>
               <a:graphicFrameLocks noChangeAspect="1"/>
             </wp:cNvGraphicFramePr>
@@ -3786,7 +4218,7 @@
                     <pic:cNvPicPr/>
                   </pic:nvPicPr>
                   <pic:blipFill>
-                    <a:blip r:embed="rId27"/>
+                    <a:blip r:embed="rId28"/>
                     <a:stretch>
                       <a:fillRect/>
                     </a:stretch>
@@ -4027,7 +4459,7 @@
         <w:drawing>
           <wp:inline xmlns:a="http://schemas.openxmlformats.org/drawingml/2006/main" xmlns:pic="http://schemas.openxmlformats.org/drawingml/2006/picture">
             <wp:extent cx="5760720" cy="7331825"/>
-            <wp:docPr id="20" name="Picture 20"/>
+            <wp:docPr id="21" name="Picture 21"/>
             <wp:cNvGraphicFramePr>
               <a:graphicFrameLocks noChangeAspect="1"/>
             </wp:cNvGraphicFramePr>
@@ -4039,7 +4471,7 @@
                     <pic:cNvPicPr/>
                   </pic:nvPicPr>
                   <pic:blipFill>
-                    <a:blip r:embed="rId28"/>
+                    <a:blip r:embed="rId29"/>
                     <a:stretch>
                       <a:fillRect/>
                     </a:stretch>
@@ -4269,7 +4701,7 @@
         <w:drawing>
           <wp:inline xmlns:a="http://schemas.openxmlformats.org/drawingml/2006/main" xmlns:pic="http://schemas.openxmlformats.org/drawingml/2006/picture">
             <wp:extent cx="5760720" cy="6026757"/>
-            <wp:docPr id="21" name="Picture 21"/>
+            <wp:docPr id="22" name="Picture 22"/>
             <wp:cNvGraphicFramePr>
               <a:graphicFrameLocks noChangeAspect="1"/>
             </wp:cNvGraphicFramePr>
@@ -4281,7 +4713,7 @@
                     <pic:cNvPicPr/>
                   </pic:nvPicPr>
                   <pic:blipFill>
-                    <a:blip r:embed="rId29"/>
+                    <a:blip r:embed="rId30"/>
                     <a:stretch>
                       <a:fillRect/>
                     </a:stretch>
@@ -4318,6 +4750,305 @@
         <w:pStyle w:val="Heading2"/>
       </w:pPr>
       <w:r>
+        <w:t>🔊 Seed Audio</w:t>
+      </w:r>
+    </w:p>
+    <w:p>
+      <w:r>
+        <w:rPr/>
+        <w:t xml:space="preserve">Generate </w:t>
+      </w:r>
+      <w:r>
+        <w:rPr>
+          <w:b/>
+        </w:rPr>
+        <w:t>voice, music and sound effects</w:t>
+      </w:r>
+      <w:r>
+        <w:rPr/>
+        <w:t xml:space="preserve"> with </w:t>
+      </w:r>
+      <w:r>
+        <w:rPr>
+          <w:b/>
+        </w:rPr>
+        <w:t>Seed Audio 1.0</w:t>
+      </w:r>
+      <w:r>
+        <w:rPr/>
+        <w:t>, then reuse them in your videos.</w:t>
+      </w:r>
+    </w:p>
+    <w:p>
+      <w:pPr>
+        <w:pStyle w:val="ListNumber"/>
+      </w:pPr>
+      <w:r>
+        <w:rPr>
+          <w:b/>
+        </w:rPr>
+        <w:t>BYTEPLUS &gt; Seed Audio</w:t>
+      </w:r>
+      <w:r>
+        <w:rPr/>
+        <w:t xml:space="preserve"> (first paste your </w:t>
+      </w:r>
+      <w:r>
+        <w:rPr>
+          <w:b/>
+        </w:rPr>
+        <w:t>Seed Audio API key</w:t>
+      </w:r>
+      <w:r>
+        <w:rPr/>
+        <w:t xml:space="preserve"> in Settings &gt; API &amp; Models — it's a </w:t>
+      </w:r>
+      <w:r>
+        <w:rPr>
+          <w:i/>
+        </w:rPr>
+        <w:t>separate</w:t>
+      </w:r>
+      <w:r>
+        <w:rPr/>
+        <w:t xml:space="preserve"> key from the Voice console).</w:t>
+      </w:r>
+    </w:p>
+    <w:p>
+      <w:pPr>
+        <w:pStyle w:val="ListNumber"/>
+      </w:pPr>
+      <w:r>
+        <w:rPr/>
+        <w:t xml:space="preserve">Pick a </w:t>
+      </w:r>
+      <w:r>
+        <w:rPr>
+          <w:b/>
+        </w:rPr>
+        <w:t>mode</w:t>
+      </w:r>
+      <w:r>
+        <w:rPr/>
+        <w:t xml:space="preserve">: 🎙️ </w:t>
+      </w:r>
+      <w:r>
+        <w:rPr>
+          <w:b/>
+        </w:rPr>
+        <w:t>Voice / TTS</w:t>
+      </w:r>
+      <w:r>
+        <w:rPr/>
+        <w:t xml:space="preserve">, 🎵 </w:t>
+      </w:r>
+      <w:r>
+        <w:rPr>
+          <w:b/>
+        </w:rPr>
+        <w:t>Music &amp; SFX</w:t>
+      </w:r>
+      <w:r>
+        <w:rPr/>
+        <w:t xml:space="preserve">, or 👤 </w:t>
+      </w:r>
+      <w:r>
+        <w:rPr>
+          <w:b/>
+        </w:rPr>
+        <w:t>Clone voice</w:t>
+      </w:r>
+      <w:r>
+        <w:rPr/>
+        <w:t xml:space="preserve"> (from a reference clip).</w:t>
+      </w:r>
+    </w:p>
+    <w:p>
+      <w:pPr>
+        <w:pStyle w:val="ListNumber"/>
+      </w:pPr>
+      <w:r>
+        <w:rPr>
+          <w:b/>
+        </w:rPr>
+        <w:t>Describe the voice in the prompt</w:t>
+      </w:r>
+      <w:r>
+        <w:rPr/>
+        <w:t xml:space="preserve"> — Seed Audio's strength, e.g. </w:t>
+      </w:r>
+      <w:r>
+        <w:rPr>
+          <w:i/>
+        </w:rPr>
+        <w:t>"A warm confident male narrator says: 'Welcome to the show.'"</w:t>
+      </w:r>
+      <w:r>
+        <w:rPr/>
+        <w:t xml:space="preserve"> Multi-character scripts in one prompt are supported. Or pick a </w:t>
+      </w:r>
+      <w:r>
+        <w:rPr>
+          <w:b/>
+        </w:rPr>
+        <w:t>preset voice</w:t>
+      </w:r>
+      <w:r>
+        <w:rPr/>
+        <w:t xml:space="preserve"> (optional) and </w:t>
+      </w:r>
+      <w:r>
+        <w:rPr>
+          <w:b/>
+        </w:rPr>
+        <w:t>🔊 Preview</w:t>
+      </w:r>
+      <w:r>
+        <w:rPr/>
+        <w:t>.</w:t>
+      </w:r>
+    </w:p>
+    <w:p>
+      <w:pPr>
+        <w:pStyle w:val="ListNumber"/>
+      </w:pPr>
+      <w:r>
+        <w:rPr/>
+        <w:t xml:space="preserve">Set format / pitch / speed / length and </w:t>
+      </w:r>
+      <w:r>
+        <w:rPr>
+          <w:b/>
+        </w:rPr>
+        <w:t>Generate</w:t>
+      </w:r>
+      <w:r>
+        <w:rPr/>
+        <w:t xml:space="preserve"> → it plays and lands in the </w:t>
+      </w:r>
+      <w:r>
+        <w:rPr>
+          <w:b/>
+        </w:rPr>
+        <w:t>Audio Gallery</w:t>
+      </w:r>
+      <w:r>
+        <w:rPr/>
+        <w:t>.</w:t>
+      </w:r>
+    </w:p>
+    <w:p>
+      <w:pPr>
+        <w:jc w:val="center"/>
+      </w:pPr>
+      <w:r>
+        <w:drawing>
+          <wp:inline xmlns:a="http://schemas.openxmlformats.org/drawingml/2006/main" xmlns:pic="http://schemas.openxmlformats.org/drawingml/2006/picture">
+            <wp:extent cx="5760720" cy="4606730"/>
+            <wp:docPr id="23" name="Picture 23"/>
+            <wp:cNvGraphicFramePr>
+              <a:graphicFrameLocks noChangeAspect="1"/>
+            </wp:cNvGraphicFramePr>
+            <a:graphic>
+              <a:graphicData uri="http://schemas.openxmlformats.org/drawingml/2006/picture">
+                <pic:pic>
+                  <pic:nvPicPr>
+                    <pic:cNvPr id="0" name="Seed-Audio.jpg"/>
+                    <pic:cNvPicPr/>
+                  </pic:nvPicPr>
+                  <pic:blipFill>
+                    <a:blip r:embed="rId31"/>
+                    <a:stretch>
+                      <a:fillRect/>
+                    </a:stretch>
+                  </pic:blipFill>
+                  <pic:spPr>
+                    <a:xfrm>
+                      <a:off x="0" y="0"/>
+                      <a:ext cx="5760720" cy="4606730"/>
+                    </a:xfrm>
+                    <a:prstGeom prst="rect"/>
+                  </pic:spPr>
+                </pic:pic>
+              </a:graphicData>
+            </a:graphic>
+          </wp:inline>
+        </w:drawing>
+      </w:r>
+    </w:p>
+    <w:p>
+      <w:pPr>
+        <w:jc w:val="center"/>
+      </w:pPr>
+      <w:r>
+        <w:rPr>
+          <w:i/>
+          <w:color w:val="888888"/>
+          <w:sz w:val="17"/>
+        </w:rPr>
+        <w:t>Seed Audio</w:t>
+      </w:r>
+    </w:p>
+    <w:p>
+      <w:pPr>
+        <w:pStyle w:val="IntenseQuote"/>
+      </w:pPr>
+      <w:r>
+        <w:rPr>
+          <w:b/>
+        </w:rPr>
+        <w:t>Language:</w:t>
+      </w:r>
+      <w:r>
+        <w:rPr/>
+        <w:t xml:space="preserve"> Seed Audio currently generates </w:t>
+      </w:r>
+      <w:r>
+        <w:rPr>
+          <w:b/>
+        </w:rPr>
+        <w:t>English &amp; Chinese</w:t>
+      </w:r>
+      <w:r>
+        <w:rPr/>
+        <w:t xml:space="preserve"> (more coming). Seedance video </w:t>
+      </w:r>
+      <w:r>
+        <w:rPr>
+          <w:b/>
+        </w:rPr>
+        <w:t>dialogue</w:t>
+      </w:r>
+      <w:r>
+        <w:rPr/>
+        <w:t xml:space="preserve"> also speaks </w:t>
+      </w:r>
+      <w:r>
+        <w:rPr>
+          <w:b/>
+        </w:rPr>
+        <w:t>Spanish / Japanese / Indonesian / Portuguese</w:t>
+      </w:r>
+      <w:r>
+        <w:rPr/>
+        <w:t xml:space="preserve"> — see </w:t>
+      </w:r>
+      <w:r>
+        <w:rPr>
+          <w:b/>
+        </w:rPr>
+        <w:t>Dialogue Scene</w:t>
+      </w:r>
+      <w:r>
+        <w:rPr/>
+        <w:t xml:space="preserve"> below.</w:t>
+      </w:r>
+    </w:p>
+    <w:p>
+      <w:pPr>
+        <w:pStyle w:val="Heading2"/>
+      </w:pPr>
+      <w:r>
         <w:t>🧍 Seed Character</w:t>
       </w:r>
     </w:p>
@@ -4482,7 +5213,7 @@
         <w:drawing>
           <wp:inline xmlns:a="http://schemas.openxmlformats.org/drawingml/2006/main" xmlns:pic="http://schemas.openxmlformats.org/drawingml/2006/picture">
             <wp:extent cx="5760720" cy="8226879"/>
-            <wp:docPr id="22" name="Picture 22"/>
+            <wp:docPr id="24" name="Picture 24"/>
             <wp:cNvGraphicFramePr>
               <a:graphicFrameLocks noChangeAspect="1"/>
             </wp:cNvGraphicFramePr>
@@ -4494,7 +5225,7 @@
                     <pic:cNvPicPr/>
                   </pic:nvPicPr>
                   <pic:blipFill>
-                    <a:blip r:embed="rId30"/>
+                    <a:blip r:embed="rId32"/>
                     <a:stretch>
                       <a:fillRect/>
                     </a:stretch>
@@ -4877,13 +5608,48 @@
     </w:p>
     <w:p>
       <w:pPr>
+        <w:pStyle w:val="ListNumber"/>
+      </w:pPr>
+      <w:r>
+        <w:rPr>
+          <w:i/>
+        </w:rPr>
+        <w:t>(Optional)</w:t>
+      </w:r>
+      <w:r>
+        <w:rPr/>
+        <w:t xml:space="preserve"> give the character a </w:t>
+      </w:r>
+      <w:r>
+        <w:rPr>
+          <w:b/>
+        </w:rPr>
+        <w:t>🎙️ voice</w:t>
+      </w:r>
+      <w:r>
+        <w:rPr/>
+        <w:t xml:space="preserve"> — </w:t>
+      </w:r>
+      <w:r>
+        <w:rPr>
+          <w:b/>
+        </w:rPr>
+        <w:t>Generate voice…</w:t>
+      </w:r>
+      <w:r>
+        <w:rPr/>
+        <w:t xml:space="preserve"> (from its image, a description, or a preset). The voice is reused for consistent dialogue.</w:t>
+      </w:r>
+    </w:p>
+    <w:p>
+      <w:pPr>
         <w:jc w:val="center"/>
       </w:pPr>
       <w:r>
         <w:drawing>
           <wp:inline xmlns:a="http://schemas.openxmlformats.org/drawingml/2006/main" xmlns:pic="http://schemas.openxmlformats.org/drawingml/2006/picture">
             <wp:extent cx="5760720" cy="3119936"/>
-            <wp:docPr id="23" name="Picture 23"/>
+            <wp:docPr id="25" name="Picture 25"/>
             <wp:cNvGraphicFramePr>
               <a:graphicFrameLocks noChangeAspect="1"/>
             </wp:cNvGraphicFramePr>
@@ -4895,7 +5661,7 @@
                     <pic:cNvPicPr/>
                   </pic:nvPicPr>
                   <pic:blipFill>
-                    <a:blip r:embed="rId31"/>
+                    <a:blip r:embed="rId33"/>
                     <a:stretch>
                       <a:fillRect/>
                     </a:stretch>
@@ -4941,6 +5707,175 @@
         <w:pStyle w:val="Heading2"/>
       </w:pPr>
       <w:r>
+        <w:t>🎭 Dialogue Scene</w:t>
+      </w:r>
+    </w:p>
+    <w:p>
+      <w:r>
+        <w:rPr/>
+        <w:t xml:space="preserve">Multi-character </w:t>
+      </w:r>
+      <w:r>
+        <w:rPr>
+          <w:b/>
+        </w:rPr>
+        <w:t>spoken dialogue</w:t>
+      </w:r>
+      <w:r>
+        <w:rPr/>
+        <w:t>, generated by Seedance 2.0 with synced lips.</w:t>
+      </w:r>
+    </w:p>
+    <w:p>
+      <w:pPr>
+        <w:pStyle w:val="ListNumber"/>
+      </w:pPr>
+      <w:r>
+        <w:rPr>
+          <w:b/>
+        </w:rPr>
+        <w:t>BYTEPLUS &gt; Dialogue Scene</w:t>
+      </w:r>
+      <w:r>
+        <w:rPr/>
+        <w:t>.</w:t>
+      </w:r>
+    </w:p>
+    <w:p>
+      <w:pPr>
+        <w:pStyle w:val="ListNumber"/>
+      </w:pPr>
+      <w:r>
+        <w:rPr/>
+        <w:t xml:space="preserve">Build a </w:t>
+      </w:r>
+      <w:r>
+        <w:rPr>
+          <w:b/>
+        </w:rPr>
+        <w:t>cast</w:t>
+      </w:r>
+      <w:r>
+        <w:rPr/>
+        <w:t xml:space="preserve"> (up to 3): </w:t>
+      </w:r>
+      <w:r>
+        <w:rPr>
+          <w:b/>
+        </w:rPr>
+        <w:t>+ Add character</w:t>
+      </w:r>
+      <w:r>
+        <w:rPr/>
+        <w:t xml:space="preserve"> picks a </w:t>
+      </w:r>
+      <w:r>
+        <w:rPr>
+          <w:b/>
+        </w:rPr>
+        <w:t>Trusted Character</w:t>
+      </w:r>
+      <w:r>
+        <w:rPr/>
+        <w:t xml:space="preserve"> (its image + its voice, if it has one).</w:t>
+      </w:r>
+    </w:p>
+    <w:p>
+      <w:pPr>
+        <w:pStyle w:val="ListNumber"/>
+      </w:pPr>
+      <w:r>
+        <w:rPr/>
+        <w:t xml:space="preserve">Write the </w:t>
+      </w:r>
+      <w:r>
+        <w:rPr>
+          <w:b/>
+        </w:rPr>
+        <w:t>script</w:t>
+      </w:r>
+      <w:r>
+        <w:rPr/>
+        <w:t xml:space="preserve">, one line per character: </w:t>
+      </w:r>
+      <w:r>
+        <w:rPr>
+          <w:rFonts w:ascii="Consolas" w:hAnsi="Consolas"/>
+          <w:color w:val="333333"/>
+        </w:rPr>
+        <w:t>@Ana: ¡Hola Danny! ¿Cómo estás?</w:t>
+      </w:r>
+      <w:r>
+        <w:rPr/>
+        <w:t xml:space="preserve">  /  </w:t>
+      </w:r>
+      <w:r>
+        <w:rPr>
+          <w:rFonts w:ascii="Consolas" w:hAnsi="Consolas"/>
+          <w:color w:val="333333"/>
+        </w:rPr>
+        <w:t>@Danny: Muy bien, ¿y tú?</w:t>
+      </w:r>
+    </w:p>
+    <w:p>
+      <w:pPr>
+        <w:pStyle w:val="ListNumber"/>
+      </w:pPr>
+      <w:r>
+        <w:rPr/>
+        <w:t xml:space="preserve">Optionally add a </w:t>
+      </w:r>
+      <w:r>
+        <w:rPr>
+          <w:b/>
+        </w:rPr>
+        <w:t>Scene</w:t>
+      </w:r>
+      <w:r>
+        <w:rPr/>
+        <w:t xml:space="preserve"> line (setting / mood / camera), pick the duration, and </w:t>
+      </w:r>
+      <w:r>
+        <w:rPr>
+          <w:b/>
+        </w:rPr>
+        <w:t>Generate scene</w:t>
+      </w:r>
+      <w:r>
+        <w:rPr/>
+        <w:t xml:space="preserve"> → the clip lands in the Video Gallery.</w:t>
+      </w:r>
+    </w:p>
+    <w:p>
+      <w:pPr>
+        <w:pStyle w:val="IntenseQuote"/>
+      </w:pPr>
+      <w:r>
+        <w:rPr>
+          <w:b/>
+        </w:rPr>
+        <w:t>Works in Spanish</w:t>
+      </w:r>
+      <w:r>
+        <w:rPr/>
+        <w:t xml:space="preserve"> (and English / Japanese / Indonesian / Portuguese) — Seedance speaks the lines directly. Give each character a voice in </w:t>
+      </w:r>
+      <w:r>
+        <w:rPr>
+          <w:b/>
+        </w:rPr>
+        <w:t>Trusted Characters</w:t>
+      </w:r>
+      <w:r>
+        <w:rPr/>
+        <w:t xml:space="preserve"> for a consistent timbre.</w:t>
+      </w:r>
+    </w:p>
+    <w:p>
+      <w:pPr>
+        <w:pStyle w:val="Heading2"/>
+      </w:pPr>
+      <w:r>
         <w:t>🧱 Blockout from image</w:t>
       </w:r>
     </w:p>
@@ -5267,7 +6202,7 @@
         <w:drawing>
           <wp:inline xmlns:a="http://schemas.openxmlformats.org/drawingml/2006/main" xmlns:pic="http://schemas.openxmlformats.org/drawingml/2006/picture">
             <wp:extent cx="5760720" cy="6970471"/>
-            <wp:docPr id="24" name="Picture 24"/>
+            <wp:docPr id="26" name="Picture 26"/>
             <wp:cNvGraphicFramePr>
               <a:graphicFrameLocks noChangeAspect="1"/>
             </wp:cNvGraphicFramePr>
@@ -5279,7 +6214,7 @@
                     <pic:cNvPicPr/>
                   </pic:nvPicPr>
                   <pic:blipFill>
-                    <a:blip r:embed="rId32"/>
+                    <a:blip r:embed="rId34"/>
                     <a:stretch>
                       <a:fillRect/>
                     </a:stretch>
@@ -6011,7 +6946,7 @@
         <w:drawing>
           <wp:inline xmlns:a="http://schemas.openxmlformats.org/drawingml/2006/main" xmlns:pic="http://schemas.openxmlformats.org/drawingml/2006/picture">
             <wp:extent cx="5760720" cy="2287946"/>
-            <wp:docPr id="25" name="Picture 25"/>
+            <wp:docPr id="27" name="Picture 27"/>
             <wp:cNvGraphicFramePr>
               <a:graphicFrameLocks noChangeAspect="1"/>
             </wp:cNvGraphicFramePr>
@@ -6023,7 +6958,7 @@
                     <pic:cNvPicPr/>
                   </pic:nvPicPr>
                   <pic:blipFill>
-                    <a:blip r:embed="rId33"/>
+                    <a:blip r:embed="rId35"/>
                     <a:stretch>
                       <a:fillRect/>
                     </a:stretch>
@@ -6465,7 +7400,7 @@
         <w:drawing>
           <wp:inline xmlns:a="http://schemas.openxmlformats.org/drawingml/2006/main" xmlns:pic="http://schemas.openxmlformats.org/drawingml/2006/picture">
             <wp:extent cx="5760720" cy="4810924"/>
-            <wp:docPr id="26" name="Picture 26"/>
+            <wp:docPr id="28" name="Picture 28"/>
             <wp:cNvGraphicFramePr>
               <a:graphicFrameLocks noChangeAspect="1"/>
             </wp:cNvGraphicFramePr>
@@ -6477,7 +7412,7 @@
                     <pic:cNvPicPr/>
                   </pic:nvPicPr>
                   <pic:blipFill>
-                    <a:blip r:embed="rId34"/>
+                    <a:blip r:embed="rId36"/>
                     <a:stretch>
                       <a:fillRect/>
                     </a:stretch>
@@ -6517,7 +7452,7 @@
         <w:drawing>
           <wp:inline xmlns:a="http://schemas.openxmlformats.org/drawingml/2006/main" xmlns:pic="http://schemas.openxmlformats.org/drawingml/2006/picture">
             <wp:extent cx="5760720" cy="4742250"/>
-            <wp:docPr id="27" name="Picture 27"/>
+            <wp:docPr id="29" name="Picture 29"/>
             <wp:cNvGraphicFramePr>
               <a:graphicFrameLocks noChangeAspect="1"/>
             </wp:cNvGraphicFramePr>
@@ -6529,7 +7464,7 @@
                     <pic:cNvPicPr/>
                   </pic:nvPicPr>
                   <pic:blipFill>
-                    <a:blip r:embed="rId35"/>
+                    <a:blip r:embed="rId37"/>
                     <a:stretch>
                       <a:fillRect/>
                     </a:stretch>
@@ -6570,7 +7505,7 @@
         <w:drawing>
           <wp:inline xmlns:a="http://schemas.openxmlformats.org/drawingml/2006/main" xmlns:pic="http://schemas.openxmlformats.org/drawingml/2006/picture">
             <wp:extent cx="5760720" cy="5481525"/>
-            <wp:docPr id="28" name="Picture 28"/>
+            <wp:docPr id="30" name="Picture 30"/>
             <wp:cNvGraphicFramePr>
               <a:graphicFrameLocks noChangeAspect="1"/>
             </wp:cNvGraphicFramePr>
@@ -6582,7 +7517,7 @@
                     <pic:cNvPicPr/>
                   </pic:nvPicPr>
                   <pic:blipFill>
-                    <a:blip r:embed="rId36"/>
+                    <a:blip r:embed="rId38"/>
                     <a:stretch>
                       <a:fillRect/>
                     </a:stretch>

</xml_diff>